<commit_message>
Add path-specific PREVIOUSLY sections and fix ending structure
Chapter 6.2 PREVIOUSLY:
- Added path-specific recaps for all 8 incoming paths
- Each path now gets unique context about their approach to Blackwood

Chapter 6.3 PREVIOUSLY:
- Added path-specific recaps for all 8 incoming paths
- Reflects each path's unique journey through the asylum

Fixed Chapter 6.3 ending structure:
- Extracted shared resolution ("The silence stretched..." through "The blade lowered.")
  from DA_ALLY block and made it [ALL PATHS]
- Added [IF ELARA_SERVANT] ending for P4A1-B, P4A2-A
- Added [IF WHISPER_ALLIANCE] ending for P4B2-B
- Now all 8 paths properly flow to the shared emotional climax

Ending structure is now:
1. [IF NO_ALLIES] - P2B1-A, P2B2-B, P3A2-B
2. [IF DA_ALLY] - P3B2-A, P3B2-B
3. [IF ELARA_SERVANT] - P4A1-B, P4A2-A
4. [IF WHISPER_ALLIANCE] - P4B2-B
5. [ALL PATHS] - Shared resolution leading to decision point
</commit_message>
<xml_diff>
--- a/story-revised/CoG - Chapter 6 Scenario C New Format (1).docx
+++ b/story-revised/CoG - Chapter 6 Scenario C New Format (1).docx
@@ -1241,10 +1241,23 @@
         <w:rPr/>
       </w:pPr>
       <w:r>
-        <w:rPr>
-          <w:rtl w:val="0"/>
-        </w:rPr>
-        <w:t xml:space="preserve">PREVIOUSLY: Kael approached Blackwood Asylum alone, his resources limited and his allies nonexistent. The official response was gathering at the main entrance while Kael sought a different way in, a forgotten route that might allow him to reach Lila Thorne before The Whisper could complete his endgame.</w:t>
+        <w:t>PREVIOUSLY:</w:t>
+        <w:br/>
+        <w:t>[IF VIA PATH P2B1-A: Kael's public exposure had made him famous but also a target. He approached Blackwood Asylum knowing his face would be recognized, his movements tracked. The fame that had given him a platform now made stealth nearly impossible.]</w:t>
+        <w:br/>
+        <w:t>[IF VIA PATH P2B2-B: The Whisper's broadcast had stripped away Kael's anonymity. Every operative, every corrupt cop, every enemy he had made now knew his face. He approached Blackwood as a marked man, his only advantage the chaos of the official response.]</w:t>
+        <w:br/>
+        <w:t>[IF VIA PATH P3A2-B: Kael's patience had preserved his options but left him isolated. He approached Blackwood carrying evidence no one knew he possessed, playing a long game that might end tonight one way or another.]</w:t>
+        <w:br/>
+        <w:t>[IF VIA PATH P3B2-A: Kael's commitment to public testimony had made him a known quantity. DA Cross had tried to keep him away from Blackwood, but Kael understood that some debts couldn't be paid from the witness stand.]</w:t>
+        <w:br/>
+        <w:t>[IF VIA PATH P3B2-B: Working from the shadows had kept Kael alive, but it had also kept him at arm's length from the justice he sought. Now he moved toward Blackwood alone, invisible to allies and enemies alike.]</w:t>
+        <w:br/>
+        <w:t>[IF VIA PATH P4A1-B: Kael's knowledge of Elara's secret agenda weighed on him as he approached Blackwood. He was playing multiple games now, serving multiple masters, and tonight would determine which loyalties survived.]</w:t>
+        <w:br/>
+        <w:t>[IF VIA PATH P4A2-A: The questions Kael had finally started asking had cost him Elara's trust. He approached Blackwood as something between asset and liability, uncertain whether the organization would welcome him back or dispose of him.]</w:t>
+        <w:br/>
+        <w:t>[IF VIA PATH P4B2-B: The Whisper had treated Kael's wound, shared shelter and plans. Now Kael walked toward Crane's endgame, uncertain whether their alliance would survive what came next. His wound had healed enough to move, but not enough to fight.]</w:t>
       </w:r>
     </w:p>
     <w:p>
@@ -2202,10 +2215,23 @@
         <w:rPr/>
       </w:pPr>
       <w:r>
-        <w:rPr>
-          <w:rtl w:val="0"/>
-        </w:rPr>
-        <w:t xml:space="preserve">PREVIOUSLY: Kael infiltrated Blackwood Asylum through the forgotten coal chute, navigating the ruined basement and patient wards while the official assault occupied The Whisper's attention. Wounded, under-resourced, but determined, he reached the surgical theater where Lila Thorne was being held.</w:t>
+        <w:t>PREVIOUSLY:</w:t>
+        <w:br/>
+        <w:t>[IF VIA PATH P2B1-A: Kael infiltrated Blackwood through the forgotten coal chute, his famous face hidden in darkness. The journey through the asylum's bowels had been a descent into memory, every shadow holding echoes of the night Sarah Vance died.]</w:t>
+        <w:br/>
+        <w:t>[IF VIA PATH P2B2-B: Kael navigated the asylum's ruins alone, his marked status making every shadow a potential threat. He had made it this far on desperation and luck. Now he faced the surgical theater where everything had begun.]</w:t>
+        <w:br/>
+        <w:t>[IF VIA PATH P3A2-B: Kael carried his hidden evidence through Blackwood's depths, Harold Metz's ghost walking beside him. The patience that had defined his approach would be tested in the surgical theater above.]</w:t>
+        <w:br/>
+        <w:t>[IF VIA PATH P3B2-A: Kael climbed toward the confrontation that his public testimony had been building toward. Harold Metz's ghost reminded him that the dead don't need vengeance, but the living needed something. Perhaps this was it.]</w:t>
+        <w:br/>
+        <w:t>[IF VIA PATH P3B2-B: Working from shadows had brought Kael here, to the heart of darkness. Harold Metz walked beside him, the weight of innocent blood a constant companion as he approached the surgical theater.]</w:t>
+        <w:br/>
+        <w:t>[IF VIA PATH P4A1-B: Kael's wounded shoulder screamed as he climbed toward the surgical theater. He carried Elara's secrets and his own doubts, uncertain whether the knowledge he possessed would be weapon or liability.]</w:t>
+        <w:br/>
+        <w:t>[IF VIA PATH P4A2-A: The questions Kael had started asking had led him here, wounded and uncertain. He had broken free of blind obedience, but freedom meant facing consequences alone.]</w:t>
+        <w:br/>
+        <w:t>[IF VIA PATH P4B2-B: Kael climbed toward a confrontation with his unlikely ally. The Whisper had helped him survive, but survival and trust were different currencies. Tonight would reveal which one mattered more.]</w:t>
       </w:r>
     </w:p>
     <w:p>
@@ -3348,10 +3374,82 @@
         <w:rPr/>
       </w:pPr>
       <w:r>
-        <w:rPr>
-          <w:rtl w:val="0"/>
-        </w:rPr>
-        <w:t xml:space="preserve">"You get to speak. In a courtroom, on the record, with the whole world watching. You get to say Emily's name and have it matter. You get to be more than The Whisper, more than a killer, more than a cautionary tale. You get to be the man who finally held the powerful accountable."</w:t>
+        <w:t>"You get to speak. In a courtroom, on the record, with the whole world watching. You get to say Emily's name and have it matter. You get to be more than The Whisper, more than a killer, more than a cautionary tale. You get to be the man who finally held the powerful accountable." ]</w:t>
+      </w:r>
+    </w:p>
+    <w:p>
+      <w:r>
+        <w:t>[IF ELARA_SERVANT:</w:t>
+      </w:r>
+    </w:p>
+    <w:p>
+      <w:r>
+        <w:t>(Read this if you came via: P4A1-B, P4A2-A)</w:t>
+      </w:r>
+    </w:p>
+    <w:p>
+      <w:r>
+        <w:t>"Elara Vance is out there somewhere," Kael said. "Building her case against Victor. She's been working toward his destruction for ten years. You're not the only one who wants him to pay."</w:t>
+      </w:r>
+    </w:p>
+    <w:p>
+      <w:r>
+        <w:t>The Whisper's expression flickered with something that might have been interest, or suspicion. "You're suggesting we have common enemies."</w:t>
+      </w:r>
+    </w:p>
+    <w:p>
+      <w:r>
+        <w:t>"I'm suggesting that your war doesn't have to end tonight. That there are other ways to hurt Victor Thorne. Ways that don't require killing his sister to make a point."</w:t>
+      </w:r>
+    </w:p>
+    <w:p>
+      <w:r>
+        <w:t>"And Elara sent you to deliver this message?"</w:t>
+      </w:r>
+    </w:p>
+    <w:p>
+      <w:r>
+        <w:t>"Elara doesn't know I'm here. This isn't her play. It's mine." ]</w:t>
+      </w:r>
+    </w:p>
+    <w:p>
+      <w:r>
+        <w:t>[IF WHISPER_ALLIANCE:</w:t>
+      </w:r>
+    </w:p>
+    <w:p>
+      <w:r>
+        <w:t>(Read this if you came via: P4B2-B)</w:t>
+      </w:r>
+    </w:p>
+    <w:p>
+      <w:r>
+        <w:t>"We had an agreement," Kael said quietly. "You helped me. Treated my wound. Gave me shelter when everyone else was hunting me. I came here because I owed you that."</w:t>
+      </w:r>
+    </w:p>
+    <w:p>
+      <w:r>
+        <w:t>The Whisper studied him for a long moment. "You came here to honor a debt to a serial killer."</w:t>
+      </w:r>
+    </w:p>
+    <w:p>
+      <w:r>
+        <w:t>"I came here because you're the only person who's been honest with me in three years. About what this city really is. About what it takes to survive in it." Kael met Crane's eyes. "I'm not your enemy, Thomas. I never was."</w:t>
+      </w:r>
+    </w:p>
+    <w:p>
+      <w:r>
+        <w:t>"Then what are you?"</w:t>
+      </w:r>
+    </w:p>
+    <w:p>
+      <w:r>
+        <w:t>"Someone who understands why you did what you did. Even if I can't condone it." ]</w:t>
+      </w:r>
+    </w:p>
+    <w:p>
+      <w:r>
+        <w:t>[ALL PATHS:</w:t>
       </w:r>
     </w:p>
     <w:p>
@@ -3436,26 +3534,7 @@
         <w:rPr/>
       </w:pPr>
       <w:r>
-        <w:rPr>
-          <w:rtl w:val="0"/>
-        </w:rPr>
-        <w:t xml:space="preserve">The blade lowered. </w:t>
-      </w:r>
-      <w:r>
-        <w:rPr>
-          <w:b w:val="1"/>
-          <w:bCs w:val="1"/>
-          <w:i w:val="1"/>
-          <w:iCs w:val="1"/>
-          <w:color w:val="0000c8"/>
-          <w:rtl w:val="0"/>
-        </w:rPr>
-        <w:t xml:space="preserve">]</w:t>
-      </w:r>
-      <w:r>
-        <w:rPr>
-          <w:rtl w:val="0"/>
-        </w:rPr>
+        <w:t>The blade lowered. ]</w:t>
       </w:r>
     </w:p>
     <w:p>

</xml_diff>